<commit_message>
L and JD's article
</commit_message>
<xml_diff>
--- a/assets/Emissions by Scope An Input-Output Analysis_v3.docx
+++ b/assets/Emissions by Scope An Input-Output Analysis_v3.docx
@@ -9,22 +9,7 @@
         <w:jc w:val="both"/>
       </w:pPr>
       <w:r>
-        <w:t xml:space="preserve">In this article, we explore how can Input-Output analysis </w:t>
-      </w:r>
-      <w:r>
-        <w:t xml:space="preserve">can </w:t>
-      </w:r>
-      <w:r>
-        <w:t>help us calculate emissions by Scope, how dirty the supply chains that power the Spanish economy</w:t>
-      </w:r>
-      <w:r>
-        <w:t xml:space="preserve"> are</w:t>
-      </w:r>
-      <w:r>
-        <w:t>, and whether certain sectors do more harm than good when accounting for their climate damages</w:t>
-      </w:r>
-      <w:r>
-        <w:t>.</w:t>
+        <w:t>In this article, we explore how can Input-Output analysis can help us calculate emissions by Scope, how dirty the supply chains that power the Spanish economy are, and whether certain sectors do more harm than good when accounting for their climate damages.</w:t>
       </w:r>
     </w:p>
     <w:p>
@@ -912,17 +897,10 @@
     </w:p>
     <w:p>
       <w:pPr>
-        <w:jc w:val="both"/>
-        <w:rPr>
-          <w:b/>
-          <w:bCs/>
-        </w:rPr>
-      </w:pPr>
-      <w:r>
-        <w:rPr>
-          <w:b/>
-          <w:bCs/>
-        </w:rPr>
+        <w:pStyle w:val="Heading2"/>
+      </w:pPr>
+      <w:r>
+        <w:lastRenderedPageBreak/>
         <w:t>Appendix</w:t>
       </w:r>
     </w:p>
@@ -1960,6 +1938,7 @@
         <w:jc w:val="both"/>
       </w:pPr>
       <w:r>
+        <w:lastRenderedPageBreak/>
         <w:t>That’s the entire upstream production chain.</w:t>
       </w:r>
     </w:p>
@@ -1977,7 +1956,6 @@
           <w:b/>
           <w:bCs/>
         </w:rPr>
-        <w:lastRenderedPageBreak/>
         <w:t>Footnotes:</w:t>
       </w:r>
     </w:p>

</xml_diff>